<commit_message>
afcca opening-brief docx: Times New Roman (the typst face) via docx/reference.xml, XML-identical to the old builder's output with the font changed (docxref: w:latentStyles kept in replace mode, self-closing elements parsed); check.sh --engine docx 16 passed 0 failed (fb-595.63)
</commit_message>
<xml_diff>
--- a/courts/military/air-force-court-of-criminal-appeals/opening-brief/usage/OUTPUT-opening-brief-2.docx
+++ b/courts/military/air-force-court-of-criminal-appeals/opening-brief/usage/OUTPUT-opening-brief-2.docx
@@ -1164,11 +1164,11 @@
 </file>
 
 <file path=word/styles.xml><?xml version="1.0" encoding="utf-8"?>
-<w:styles xmlns:r="http://schemas.openxmlformats.org/officeDocument/2006/relationships" xmlns:w="http://schemas.openxmlformats.org/wordprocessingml/2006/main">
+<w:styles xmlns:w="http://schemas.openxmlformats.org/wordprocessingml/2006/main" xmlns:r="http://schemas.openxmlformats.org/officeDocument/2006/relationships">
   <w:docDefaults>
     <w:rPrDefault>
       <w:rPr>
-        <w:rFonts w:ascii="EB Garamond" w:hAnsi="EB Garamond" w:eastAsia="EB Garamond" w:cs="EB Garamond"/>
+        <w:rFonts w:ascii="Times New Roman" w:hAnsi="Times New Roman" w:eastAsia="Times New Roman" w:cs="Times New Roman"/>
         <w:sz w:val="24"/>
         <w:szCs w:val="24"/>
         <w:lang w:val="en-US" w:eastAsia="en-US" w:bidi="ar-SA"/>
@@ -1667,7 +1667,7 @@
       <w:jc w:val="left"/>
     </w:pPr>
     <w:rPr>
-      <w:rFonts w:ascii="EB Garamond" w:hAnsi="EB Garamond" w:eastAsia="EB Garamond" w:cs="EB Garamond"/>
+      <w:rFonts w:ascii="Times New Roman" w:hAnsi="Times New Roman" w:eastAsia="Times New Roman" w:cs="Times New Roman"/>
       <w:sz w:val="24"/>
       <w:szCs w:val="24"/>
     </w:rPr>

</xml_diff>